<commit_message>
made it colourful and minor bug fixes
</commit_message>
<xml_diff>
--- a/Report.docx
+++ b/Report.docx
@@ -443,7 +443,15 @@
       </w:pPr>
       <w:r>
         <w:rPr/>
-        <w:t>After guessing a message is displayed for three seconds telling them what sort of object they uncovered and the effect that it has on them before showing what the board looks like and the new values of their points and health.</w:t>
+        <w:t xml:space="preserve">After guessing a message is displayed for </w:t>
+      </w:r>
+      <w:r>
+        <w:rPr/>
+        <w:t>two</w:t>
+      </w:r>
+      <w:r>
+        <w:rPr/>
+        <w:t xml:space="preserve"> seconds telling them what sort of object they uncovered and the effect that it has on them before showing what the board looks like and the new values of their points and health.</w:t>
       </w:r>
     </w:p>
     <w:p>

</xml_diff>

<commit_message>
cleaned up help page and added more to report
</commit_message>
<xml_diff>
--- a/Report.docx
+++ b/Report.docx
@@ -38,19 +38,6 @@
       </w:pPr>
       <w:r>
         <w:rPr/>
-        <w:t>Any major design considerations you made, e.g., did you choose to use a certain feature, a certain way of representing the game board, did you choose to implement something in a particular way? What was the main driving factor for these decisions? If applicable, please include pseudocode for any complex areas of the game that you had to think about / design in advance of coding.</w:t>
-      </w:r>
-    </w:p>
-    <w:p>
-      <w:pPr>
-        <w:pStyle w:val="PreformattedText"/>
-        <w:bidi w:val="0"/>
-        <w:spacing w:before="0" w:after="0"/>
-        <w:jc w:val="start"/>
-        <w:rPr/>
-      </w:pPr>
-      <w:r>
-        <w:rPr/>
         <w:t>An extended critical, self-evaluation of the main challenges, strengths and weaknesses encountered during development. Please highlight aspects of your code which you are particularly pleased with / proud of.</w:t>
       </w:r>
     </w:p>
@@ -76,18 +63,11 @@
       </w:pPr>
       <w:r>
         <w:rPr/>
-      </w:r>
-    </w:p>
-    <w:p>
-      <w:pPr>
-        <w:pStyle w:val="PreformattedText"/>
-        <w:bidi w:val="0"/>
-        <w:spacing w:before="0" w:after="0"/>
-        <w:jc w:val="start"/>
-        <w:rPr/>
-      </w:pPr>
-      <w:r>
-        <w:rPr/>
+        <w:t xml:space="preserve">        </w:t>
+      </w:r>
+      <w:r>
+        <w:rPr/>
+        <w:t>- - - PLEASE RUN THE .JAR IN A TERMINAL FOR FULL EXPERIENCE - - -</w:t>
       </w:r>
     </w:p>
     <w:p>
@@ -162,6 +142,18 @@
       </w:pPr>
       <w:r>
         <w:rPr/>
+      </w:r>
+    </w:p>
+    <w:p>
+      <w:pPr>
+        <w:pStyle w:val="PreformattedText"/>
+        <w:bidi w:val="0"/>
+        <w:spacing w:before="0" w:after="0"/>
+        <w:jc w:val="start"/>
+        <w:rPr/>
+      </w:pPr>
+      <w:r>
+        <w:rPr/>
         <w:t>I managed to implement all the basic features fairly easily almost exactly as specified.</w:t>
       </w:r>
     </w:p>
@@ -187,213 +179,517 @@
       </w:pPr>
       <w:r>
         <w:rPr/>
-        <w:t>Objects within the game are represented by uppercase letters -</w:t>
-      </w:r>
-    </w:p>
-    <w:p>
-      <w:pPr>
-        <w:pStyle w:val="PreformattedText"/>
-        <w:bidi w:val="0"/>
-        <w:spacing w:before="0" w:after="0"/>
-        <w:jc w:val="start"/>
-        <w:rPr/>
-      </w:pPr>
-      <w:r>
-        <w:rPr/>
-        <w:t>Creatures:</w:t>
-        <w:tab/>
-        <w:tab/>
-        <w:tab/>
-        <w:t>Extras:</w:t>
-      </w:r>
-    </w:p>
-    <w:p>
-      <w:pPr>
-        <w:pStyle w:val="PreformattedText"/>
-        <w:bidi w:val="0"/>
-        <w:spacing w:before="0" w:after="0"/>
-        <w:jc w:val="start"/>
-        <w:rPr/>
-      </w:pPr>
-      <w:r>
-        <w:rPr/>
-        <w:tab/>
-        <w:t>Fish: FF</w:t>
-        <w:tab/>
-        <w:tab/>
-        <w:tab/>
-        <w:t>Bomb: B</w:t>
-      </w:r>
-    </w:p>
-    <w:p>
-      <w:pPr>
-        <w:pStyle w:val="PreformattedText"/>
-        <w:bidi w:val="0"/>
-        <w:spacing w:before="0" w:after="0"/>
-        <w:jc w:val="start"/>
-        <w:rPr/>
-      </w:pPr>
-      <w:r>
-        <w:rPr/>
-        <w:tab/>
-        <w:t>Sea Snake: SSSS</w:t>
-        <w:tab/>
-        <w:tab/>
-        <w:t>Medicinal Seaweed: H</w:t>
-      </w:r>
-    </w:p>
-    <w:p>
-      <w:pPr>
-        <w:pStyle w:val="PreformattedText"/>
-        <w:bidi w:val="0"/>
-        <w:spacing w:before="0" w:after="0"/>
-        <w:jc w:val="start"/>
-        <w:rPr/>
-      </w:pPr>
-      <w:r>
-        <w:rPr/>
-        <w:tab/>
-        <w:t>Crab: CC</w:t>
-        <w:tab/>
-        <w:tab/>
-        <w:tab/>
-        <w:t>MegaGuess: M</w:t>
-      </w:r>
-    </w:p>
-    <w:p>
-      <w:pPr>
-        <w:pStyle w:val="PreformattedText"/>
-        <w:bidi w:val="0"/>
-        <w:spacing w:before="0" w:after="0"/>
-        <w:jc w:val="start"/>
-        <w:rPr/>
-      </w:pPr>
-      <w:r>
-        <w:rPr/>
-        <w:tab/>
-        <w:t xml:space="preserve">      CC</w:t>
-        <w:tab/>
-        <w:tab/>
-        <w:tab/>
-        <w:t>Void: X</w:t>
-      </w:r>
-    </w:p>
-    <w:p>
-      <w:pPr>
-        <w:pStyle w:val="PreformattedText"/>
-        <w:bidi w:val="0"/>
-        <w:spacing w:before="0" w:after="0"/>
-        <w:jc w:val="start"/>
-        <w:rPr/>
-      </w:pPr>
-      <w:r>
-        <w:rPr/>
-        <w:tab/>
-        <w:t>Starfish:  O</w:t>
-        <w:tab/>
-      </w:r>
-    </w:p>
-    <w:p>
-      <w:pPr>
-        <w:pStyle w:val="PreformattedText"/>
-        <w:bidi w:val="0"/>
-        <w:spacing w:before="0" w:after="0"/>
-        <w:jc w:val="start"/>
-        <w:rPr/>
-      </w:pPr>
-      <w:r>
-        <w:rPr/>
-        <w:tab/>
-        <w:t xml:space="preserve">          OOO</w:t>
-      </w:r>
-    </w:p>
-    <w:p>
-      <w:pPr>
-        <w:pStyle w:val="PreformattedText"/>
-        <w:bidi w:val="0"/>
-        <w:spacing w:before="0" w:after="0"/>
-        <w:jc w:val="start"/>
-        <w:rPr/>
-      </w:pPr>
-      <w:r>
-        <w:rPr/>
-        <w:tab/>
-        <w:t xml:space="preserve">           O</w:t>
-      </w:r>
-    </w:p>
-    <w:p>
-      <w:pPr>
-        <w:pStyle w:val="PreformattedText"/>
-        <w:bidi w:val="0"/>
-        <w:spacing w:before="0" w:after="0"/>
-        <w:jc w:val="start"/>
-        <w:rPr/>
-      </w:pPr>
-      <w:r>
-        <w:rPr/>
-      </w:r>
-    </w:p>
-    <w:p>
-      <w:pPr>
-        <w:pStyle w:val="PreformattedText"/>
-        <w:bidi w:val="0"/>
-        <w:spacing w:before="0" w:after="0"/>
-        <w:jc w:val="start"/>
-        <w:rPr/>
-      </w:pPr>
-      <w:r>
-        <w:rPr/>
-        <w:t>If I had longer I would spend more time on making more creatures with more interesting shapes.</w:t>
-      </w:r>
-    </w:p>
-    <w:p>
-      <w:pPr>
-        <w:pStyle w:val="PreformattedText"/>
-        <w:bidi w:val="0"/>
-        <w:spacing w:before="0" w:after="0"/>
-        <w:jc w:val="start"/>
-        <w:rPr/>
-      </w:pPr>
-      <w:r>
-        <w:rPr/>
-      </w:r>
-    </w:p>
-    <w:p>
-      <w:pPr>
-        <w:pStyle w:val="PreformattedText"/>
-        <w:bidi w:val="0"/>
-        <w:spacing w:before="0" w:after="0"/>
-        <w:jc w:val="start"/>
-        <w:rPr/>
-      </w:pPr>
-      <w:r>
-        <w:rPr/>
-        <w:t>I took into consideration the ratio between the size of the board and number of creatures too. Its hard coded the way I think it works best but in the future I might make it so you can specify the size of the board as arguments when launching the game which would change the number of objects on the board.</w:t>
-      </w:r>
-    </w:p>
-    <w:p>
-      <w:pPr>
-        <w:pStyle w:val="PreformattedText"/>
-        <w:bidi w:val="0"/>
-        <w:spacing w:before="0" w:after="0"/>
-        <w:jc w:val="start"/>
-        <w:rPr/>
-      </w:pPr>
-      <w:r>
-        <w:rPr/>
-      </w:r>
-    </w:p>
-    <w:p>
-      <w:pPr>
-        <w:pStyle w:val="PreformattedText"/>
-        <w:bidi w:val="0"/>
-        <w:spacing w:before="0" w:after="0"/>
-        <w:jc w:val="start"/>
-        <w:rPr/>
-      </w:pPr>
-      <w:r>
-        <w:rPr/>
-        <w:t>The blank grid is represented using ~ characters because I reckon it represents water pretty well.</w:t>
+        <w:t>Objects within the game are represented by uppercase letters. If I had longer I would spend more time on making more creatures with more interesting shapes.</w:t>
+      </w:r>
+    </w:p>
+    <w:tbl>
+      <w:tblPr>
+        <w:tblW w:w="5000" w:type="pct"/>
+        <w:jc w:val="start"/>
+        <w:tblInd w:w="-5" w:type="dxa"/>
+        <w:tblLayout w:type="fixed"/>
+        <w:tblCellMar>
+          <w:top w:w="55" w:type="dxa"/>
+          <w:start w:w="55" w:type="dxa"/>
+          <w:bottom w:w="55" w:type="dxa"/>
+          <w:end w:w="55" w:type="dxa"/>
+        </w:tblCellMar>
+      </w:tblPr>
+      <w:tblGrid>
+        <w:gridCol w:w="2409"/>
+        <w:gridCol w:w="2410"/>
+        <w:gridCol w:w="2409"/>
+        <w:gridCol w:w="2410"/>
+      </w:tblGrid>
+      <w:tr>
+        <w:trPr/>
+        <w:tc>
+          <w:tcPr>
+            <w:tcW w:w="4819" w:type="dxa"/>
+            <w:gridSpan w:val="2"/>
+            <w:tcBorders>
+              <w:top w:val="single" w:sz="4" w:space="0" w:color="000000"/>
+              <w:start w:val="single" w:sz="4" w:space="0" w:color="000000"/>
+              <w:bottom w:val="single" w:sz="4" w:space="0" w:color="000000"/>
+            </w:tcBorders>
+          </w:tcPr>
+          <w:p>
+            <w:pPr>
+              <w:pStyle w:val="PreformattedText"/>
+              <w:rPr/>
+            </w:pPr>
+            <w:r>
+              <w:rPr/>
+              <w:t>CREATURES:</w:t>
+            </w:r>
+          </w:p>
+        </w:tc>
+        <w:tc>
+          <w:tcPr>
+            <w:tcW w:w="4819" w:type="dxa"/>
+            <w:gridSpan w:val="2"/>
+            <w:tcBorders>
+              <w:top w:val="single" w:sz="4" w:space="0" w:color="000000"/>
+              <w:start w:val="single" w:sz="4" w:space="0" w:color="000000"/>
+              <w:bottom w:val="single" w:sz="4" w:space="0" w:color="000000"/>
+              <w:end w:val="single" w:sz="4" w:space="0" w:color="000000"/>
+            </w:tcBorders>
+          </w:tcPr>
+          <w:p>
+            <w:pPr>
+              <w:pStyle w:val="PreformattedText"/>
+              <w:rPr/>
+            </w:pPr>
+            <w:r>
+              <w:rPr/>
+              <w:t>EXTRAS:</w:t>
+            </w:r>
+          </w:p>
+        </w:tc>
+      </w:tr>
+      <w:tr>
+        <w:trPr/>
+        <w:tc>
+          <w:tcPr>
+            <w:tcW w:w="2409" w:type="dxa"/>
+            <w:tcBorders>
+              <w:start w:val="single" w:sz="4" w:space="0" w:color="000000"/>
+              <w:bottom w:val="single" w:sz="4" w:space="0" w:color="000000"/>
+            </w:tcBorders>
+          </w:tcPr>
+          <w:p>
+            <w:pPr>
+              <w:pStyle w:val="PreformattedText"/>
+              <w:rPr/>
+            </w:pPr>
+            <w:r>
+              <w:rPr/>
+              <w:t>Fish</w:t>
+            </w:r>
+          </w:p>
+        </w:tc>
+        <w:tc>
+          <w:tcPr>
+            <w:tcW w:w="2410" w:type="dxa"/>
+            <w:tcBorders>
+              <w:start w:val="single" w:sz="4" w:space="0" w:color="000000"/>
+              <w:bottom w:val="single" w:sz="4" w:space="0" w:color="000000"/>
+            </w:tcBorders>
+          </w:tcPr>
+          <w:p>
+            <w:pPr>
+              <w:pStyle w:val="PreformattedText"/>
+              <w:rPr/>
+            </w:pPr>
+            <w:r>
+              <w:rPr/>
+              <w:t>FF</w:t>
+            </w:r>
+          </w:p>
+        </w:tc>
+        <w:tc>
+          <w:tcPr>
+            <w:tcW w:w="2409" w:type="dxa"/>
+            <w:tcBorders>
+              <w:start w:val="single" w:sz="4" w:space="0" w:color="000000"/>
+              <w:bottom w:val="single" w:sz="4" w:space="0" w:color="000000"/>
+            </w:tcBorders>
+          </w:tcPr>
+          <w:p>
+            <w:pPr>
+              <w:pStyle w:val="PreformattedText"/>
+              <w:rPr/>
+            </w:pPr>
+            <w:r>
+              <w:rPr/>
+              <w:t>Bomb</w:t>
+            </w:r>
+          </w:p>
+        </w:tc>
+        <w:tc>
+          <w:tcPr>
+            <w:tcW w:w="2410" w:type="dxa"/>
+            <w:tcBorders>
+              <w:start w:val="single" w:sz="4" w:space="0" w:color="000000"/>
+              <w:bottom w:val="single" w:sz="4" w:space="0" w:color="000000"/>
+              <w:end w:val="single" w:sz="4" w:space="0" w:color="000000"/>
+            </w:tcBorders>
+          </w:tcPr>
+          <w:p>
+            <w:pPr>
+              <w:pStyle w:val="PreformattedText"/>
+              <w:rPr/>
+            </w:pPr>
+            <w:r>
+              <w:rPr/>
+              <w:t>B</w:t>
+            </w:r>
+          </w:p>
+        </w:tc>
+      </w:tr>
+      <w:tr>
+        <w:trPr/>
+        <w:tc>
+          <w:tcPr>
+            <w:tcW w:w="2409" w:type="dxa"/>
+            <w:tcBorders>
+              <w:start w:val="single" w:sz="4" w:space="0" w:color="000000"/>
+              <w:bottom w:val="single" w:sz="4" w:space="0" w:color="000000"/>
+            </w:tcBorders>
+          </w:tcPr>
+          <w:p>
+            <w:pPr>
+              <w:pStyle w:val="PreformattedText"/>
+              <w:rPr/>
+            </w:pPr>
+            <w:r>
+              <w:rPr/>
+              <w:t>Sea Snake</w:t>
+            </w:r>
+          </w:p>
+        </w:tc>
+        <w:tc>
+          <w:tcPr>
+            <w:tcW w:w="2410" w:type="dxa"/>
+            <w:tcBorders>
+              <w:start w:val="single" w:sz="4" w:space="0" w:color="000000"/>
+              <w:bottom w:val="single" w:sz="4" w:space="0" w:color="000000"/>
+            </w:tcBorders>
+          </w:tcPr>
+          <w:p>
+            <w:pPr>
+              <w:pStyle w:val="PreformattedText"/>
+              <w:rPr/>
+            </w:pPr>
+            <w:r>
+              <w:rPr/>
+              <w:t>SSSS</w:t>
+            </w:r>
+          </w:p>
+        </w:tc>
+        <w:tc>
+          <w:tcPr>
+            <w:tcW w:w="2409" w:type="dxa"/>
+            <w:tcBorders>
+              <w:start w:val="single" w:sz="4" w:space="0" w:color="000000"/>
+              <w:bottom w:val="single" w:sz="4" w:space="0" w:color="000000"/>
+            </w:tcBorders>
+          </w:tcPr>
+          <w:p>
+            <w:pPr>
+              <w:pStyle w:val="PreformattedText"/>
+              <w:rPr/>
+            </w:pPr>
+            <w:r>
+              <w:rPr/>
+              <w:t>Medicinal Seaweed</w:t>
+            </w:r>
+          </w:p>
+        </w:tc>
+        <w:tc>
+          <w:tcPr>
+            <w:tcW w:w="2410" w:type="dxa"/>
+            <w:tcBorders>
+              <w:start w:val="single" w:sz="4" w:space="0" w:color="000000"/>
+              <w:bottom w:val="single" w:sz="4" w:space="0" w:color="000000"/>
+              <w:end w:val="single" w:sz="4" w:space="0" w:color="000000"/>
+            </w:tcBorders>
+          </w:tcPr>
+          <w:p>
+            <w:pPr>
+              <w:pStyle w:val="PreformattedText"/>
+              <w:rPr/>
+            </w:pPr>
+            <w:r>
+              <w:rPr/>
+              <w:t>H</w:t>
+            </w:r>
+          </w:p>
+        </w:tc>
+      </w:tr>
+      <w:tr>
+        <w:trPr/>
+        <w:tc>
+          <w:tcPr>
+            <w:tcW w:w="2409" w:type="dxa"/>
+            <w:tcBorders>
+              <w:start w:val="single" w:sz="4" w:space="0" w:color="000000"/>
+              <w:bottom w:val="single" w:sz="4" w:space="0" w:color="000000"/>
+            </w:tcBorders>
+          </w:tcPr>
+          <w:p>
+            <w:pPr>
+              <w:pStyle w:val="PreformattedText"/>
+              <w:rPr/>
+            </w:pPr>
+            <w:r>
+              <w:rPr/>
+              <w:t>Crab</w:t>
+            </w:r>
+          </w:p>
+        </w:tc>
+        <w:tc>
+          <w:tcPr>
+            <w:tcW w:w="2410" w:type="dxa"/>
+            <w:tcBorders>
+              <w:start w:val="single" w:sz="4" w:space="0" w:color="000000"/>
+              <w:bottom w:val="single" w:sz="4" w:space="0" w:color="000000"/>
+            </w:tcBorders>
+          </w:tcPr>
+          <w:p>
+            <w:pPr>
+              <w:pStyle w:val="PreformattedText"/>
+              <w:bidi w:val="0"/>
+              <w:spacing w:before="0" w:after="0"/>
+              <w:jc w:val="start"/>
+              <w:rPr/>
+            </w:pPr>
+            <w:r>
+              <w:rPr/>
+              <w:t>CC</w:t>
+            </w:r>
+          </w:p>
+          <w:p>
+            <w:pPr>
+              <w:pStyle w:val="PreformattedText"/>
+              <w:rPr/>
+            </w:pPr>
+            <w:r>
+              <w:rPr/>
+              <w:t>CC</w:t>
+            </w:r>
+          </w:p>
+        </w:tc>
+        <w:tc>
+          <w:tcPr>
+            <w:tcW w:w="2409" w:type="dxa"/>
+            <w:tcBorders>
+              <w:start w:val="single" w:sz="4" w:space="0" w:color="000000"/>
+              <w:bottom w:val="single" w:sz="4" w:space="0" w:color="000000"/>
+            </w:tcBorders>
+          </w:tcPr>
+          <w:p>
+            <w:pPr>
+              <w:pStyle w:val="PreformattedText"/>
+              <w:rPr/>
+            </w:pPr>
+            <w:r>
+              <w:rPr/>
+              <w:t>MegaGuess</w:t>
+            </w:r>
+          </w:p>
+        </w:tc>
+        <w:tc>
+          <w:tcPr>
+            <w:tcW w:w="2410" w:type="dxa"/>
+            <w:tcBorders>
+              <w:start w:val="single" w:sz="4" w:space="0" w:color="000000"/>
+              <w:bottom w:val="single" w:sz="4" w:space="0" w:color="000000"/>
+              <w:end w:val="single" w:sz="4" w:space="0" w:color="000000"/>
+            </w:tcBorders>
+          </w:tcPr>
+          <w:p>
+            <w:pPr>
+              <w:pStyle w:val="PreformattedText"/>
+              <w:rPr/>
+            </w:pPr>
+            <w:r>
+              <w:rPr/>
+              <w:t>M</w:t>
+            </w:r>
+          </w:p>
+        </w:tc>
+      </w:tr>
+      <w:tr>
+        <w:trPr/>
+        <w:tc>
+          <w:tcPr>
+            <w:tcW w:w="2409" w:type="dxa"/>
+            <w:tcBorders>
+              <w:start w:val="single" w:sz="4" w:space="0" w:color="000000"/>
+              <w:bottom w:val="single" w:sz="4" w:space="0" w:color="000000"/>
+            </w:tcBorders>
+          </w:tcPr>
+          <w:p>
+            <w:pPr>
+              <w:pStyle w:val="PreformattedText"/>
+              <w:rPr/>
+            </w:pPr>
+            <w:r>
+              <w:rPr/>
+              <w:t>Starfish</w:t>
+            </w:r>
+          </w:p>
+        </w:tc>
+        <w:tc>
+          <w:tcPr>
+            <w:tcW w:w="2410" w:type="dxa"/>
+            <w:tcBorders>
+              <w:start w:val="single" w:sz="4" w:space="0" w:color="000000"/>
+              <w:bottom w:val="single" w:sz="4" w:space="0" w:color="000000"/>
+            </w:tcBorders>
+          </w:tcPr>
+          <w:p>
+            <w:pPr>
+              <w:pStyle w:val="PreformattedText"/>
+              <w:rPr/>
+            </w:pPr>
+            <w:r>
+              <w:rPr/>
+              <w:t xml:space="preserve"> </w:t>
+            </w:r>
+            <w:r>
+              <w:rPr/>
+              <w:t>O</w:t>
+            </w:r>
+          </w:p>
+          <w:p>
+            <w:pPr>
+              <w:pStyle w:val="PreformattedText"/>
+              <w:rPr/>
+            </w:pPr>
+            <w:r>
+              <w:rPr/>
+              <w:t>OOO</w:t>
+            </w:r>
+          </w:p>
+          <w:p>
+            <w:pPr>
+              <w:pStyle w:val="PreformattedText"/>
+              <w:rPr/>
+            </w:pPr>
+            <w:r>
+              <w:rPr/>
+              <w:t xml:space="preserve"> </w:t>
+            </w:r>
+            <w:r>
+              <w:rPr/>
+              <w:t>O</w:t>
+            </w:r>
+          </w:p>
+        </w:tc>
+        <w:tc>
+          <w:tcPr>
+            <w:tcW w:w="2409" w:type="dxa"/>
+            <w:tcBorders>
+              <w:start w:val="single" w:sz="4" w:space="0" w:color="000000"/>
+              <w:bottom w:val="single" w:sz="4" w:space="0" w:color="000000"/>
+            </w:tcBorders>
+          </w:tcPr>
+          <w:p>
+            <w:pPr>
+              <w:pStyle w:val="PreformattedText"/>
+              <w:rPr/>
+            </w:pPr>
+            <w:r>
+              <w:rPr/>
+              <w:t>Void</w:t>
+            </w:r>
+          </w:p>
+        </w:tc>
+        <w:tc>
+          <w:tcPr>
+            <w:tcW w:w="2410" w:type="dxa"/>
+            <w:tcBorders>
+              <w:start w:val="single" w:sz="4" w:space="0" w:color="000000"/>
+              <w:bottom w:val="single" w:sz="4" w:space="0" w:color="000000"/>
+              <w:end w:val="single" w:sz="4" w:space="0" w:color="000000"/>
+            </w:tcBorders>
+          </w:tcPr>
+          <w:p>
+            <w:pPr>
+              <w:pStyle w:val="PreformattedText"/>
+              <w:rPr/>
+            </w:pPr>
+            <w:r>
+              <w:rPr/>
+              <w:t>x</w:t>
+            </w:r>
+          </w:p>
+        </w:tc>
+      </w:tr>
+    </w:tbl>
+    <w:p>
+      <w:pPr>
+        <w:pStyle w:val="PreformattedText"/>
+        <w:rPr/>
+      </w:pPr>
+      <w:r>
+        <w:rPr/>
+      </w:r>
+    </w:p>
+    <w:p>
+      <w:pPr>
+        <w:pStyle w:val="PreformattedText"/>
+        <w:bidi w:val="0"/>
+        <w:spacing w:before="0" w:after="0"/>
+        <w:jc w:val="start"/>
+        <w:rPr/>
+      </w:pPr>
+      <w:r>
+        <w:rPr/>
+        <w:t xml:space="preserve">I took into consideration the ratio between the size of the board and number of creatures too. Its hard coded the way I think it works best but </w:t>
+      </w:r>
+      <w:r>
+        <w:rPr/>
+        <w:t>if I had more time would</w:t>
+      </w:r>
+      <w:r>
+        <w:rPr/>
+        <w:t xml:space="preserve"> make it so you can specify the size of the board as </w:t>
+      </w:r>
+      <w:r>
+        <w:rPr/>
+        <w:t>command line</w:t>
+      </w:r>
+      <w:r>
+        <w:rPr/>
+        <w:t xml:space="preserve"> arguments when launching the game which would change the number of objects on the board </w:t>
+      </w:r>
+      <w:r>
+        <w:rPr/>
+        <w:t>too</w:t>
+      </w:r>
+      <w:r>
+        <w:rPr/>
+        <w:t>.</w:t>
+      </w:r>
+    </w:p>
+    <w:p>
+      <w:pPr>
+        <w:pStyle w:val="PreformattedText"/>
+        <w:bidi w:val="0"/>
+        <w:spacing w:before="0" w:after="0"/>
+        <w:jc w:val="start"/>
+        <w:rPr/>
+      </w:pPr>
+      <w:r>
+        <w:rPr/>
+      </w:r>
+    </w:p>
+    <w:p>
+      <w:pPr>
+        <w:pStyle w:val="PreformattedText"/>
+        <w:bidi w:val="0"/>
+        <w:spacing w:before="0" w:after="0"/>
+        <w:jc w:val="start"/>
+        <w:rPr/>
+      </w:pPr>
+      <w:r>
+        <w:rPr/>
+        <w:t xml:space="preserve">The blank grid is represented using </w:t>
+      </w:r>
+      <w:r>
+        <w:rPr/>
+        <w:t>+</w:t>
+      </w:r>
+      <w:r>
+        <w:rPr/>
+        <w:t xml:space="preserve"> characters because </w:t>
+      </w:r>
+      <w:r>
+        <w:rPr/>
+        <w:t>together they almost act as a grid themselves so its easier to find the coordinates for a guess.</w:t>
       </w:r>
     </w:p>
     <w:p>
@@ -443,15 +739,7 @@
       </w:pPr>
       <w:r>
         <w:rPr/>
-        <w:t xml:space="preserve">After guessing a message is displayed for </w:t>
-      </w:r>
-      <w:r>
-        <w:rPr/>
-        <w:t>two</w:t>
-      </w:r>
-      <w:r>
-        <w:rPr/>
-        <w:t xml:space="preserve"> seconds telling them what sort of object they uncovered and the effect that it has on them before showing what the board looks like and the new values of their points and health.</w:t>
+        <w:t>After guessing a message is displayed for two seconds telling them what sort of object they uncovered and the effect that it has on them before showing what the board looks like and the new values of their points and health.</w:t>
       </w:r>
     </w:p>
     <w:p>
@@ -615,126 +903,6 @@
       </w:pPr>
       <w:r>
         <w:rPr/>
-      </w:r>
-    </w:p>
-    <w:p>
-      <w:pPr>
-        <w:pStyle w:val="PreformattedText"/>
-        <w:bidi w:val="0"/>
-        <w:spacing w:before="0" w:after="0"/>
-        <w:jc w:val="start"/>
-        <w:rPr/>
-      </w:pPr>
-      <w:r>
-        <w:rPr/>
-      </w:r>
-    </w:p>
-    <w:p>
-      <w:pPr>
-        <w:pStyle w:val="PreformattedText"/>
-        <w:bidi w:val="0"/>
-        <w:spacing w:before="0" w:after="0"/>
-        <w:jc w:val="start"/>
-        <w:rPr/>
-      </w:pPr>
-      <w:r>
-        <w:rPr/>
-      </w:r>
-    </w:p>
-    <w:p>
-      <w:pPr>
-        <w:pStyle w:val="PreformattedText"/>
-        <w:bidi w:val="0"/>
-        <w:spacing w:before="0" w:after="0"/>
-        <w:jc w:val="start"/>
-        <w:rPr/>
-      </w:pPr>
-      <w:r>
-        <w:rPr/>
-      </w:r>
-    </w:p>
-    <w:p>
-      <w:pPr>
-        <w:pStyle w:val="PreformattedText"/>
-        <w:bidi w:val="0"/>
-        <w:spacing w:before="0" w:after="0"/>
-        <w:jc w:val="start"/>
-        <w:rPr/>
-      </w:pPr>
-      <w:r>
-        <w:rPr/>
-      </w:r>
-    </w:p>
-    <w:p>
-      <w:pPr>
-        <w:pStyle w:val="PreformattedText"/>
-        <w:bidi w:val="0"/>
-        <w:spacing w:before="0" w:after="0"/>
-        <w:jc w:val="start"/>
-        <w:rPr/>
-      </w:pPr>
-      <w:r>
-        <w:rPr/>
-      </w:r>
-    </w:p>
-    <w:p>
-      <w:pPr>
-        <w:pStyle w:val="PreformattedText"/>
-        <w:bidi w:val="0"/>
-        <w:spacing w:before="0" w:after="0"/>
-        <w:jc w:val="start"/>
-        <w:rPr/>
-      </w:pPr>
-      <w:r>
-        <w:rPr/>
-      </w:r>
-    </w:p>
-    <w:p>
-      <w:pPr>
-        <w:pStyle w:val="PreformattedText"/>
-        <w:bidi w:val="0"/>
-        <w:spacing w:before="0" w:after="0"/>
-        <w:jc w:val="start"/>
-        <w:rPr/>
-      </w:pPr>
-      <w:r>
-        <w:rPr/>
-      </w:r>
-    </w:p>
-    <w:p>
-      <w:pPr>
-        <w:pStyle w:val="PreformattedText"/>
-        <w:bidi w:val="0"/>
-        <w:spacing w:before="0" w:after="0"/>
-        <w:jc w:val="start"/>
-        <w:rPr/>
-      </w:pPr>
-      <w:r>
-        <w:rPr/>
-      </w:r>
-    </w:p>
-    <w:p>
-      <w:pPr>
-        <w:pStyle w:val="PreformattedText"/>
-        <w:bidi w:val="0"/>
-        <w:spacing w:before="0" w:after="0"/>
-        <w:jc w:val="start"/>
-        <w:rPr/>
-      </w:pPr>
-      <w:r>
-        <w:rPr/>
-      </w:r>
-    </w:p>
-    <w:p>
-      <w:pPr>
-        <w:pStyle w:val="PreformattedText"/>
-        <w:bidi w:val="0"/>
-        <w:spacing w:before="0" w:after="0"/>
-        <w:jc w:val="start"/>
-        <w:rPr/>
-      </w:pPr>
-      <w:r>
-        <w:rPr/>
         <w:t>There were a few things in the extra features that I chose to do differently because they made more sense to me or would benefit the players.</w:t>
       </w:r>
     </w:p>
@@ -860,57 +1028,191 @@
       </w:pPr>
       <w:r>
         <w:rPr/>
-        <w:t>The MegaGuess is implemented differently - I decided to make it reveal a whole row rather than a block of tiles as if you had guessed that row yourself meaning you receive points for creatures BUT any negative tiles like the bomb will be activated too.</w:t>
-      </w:r>
-    </w:p>
-    <w:p>
-      <w:pPr>
-        <w:pStyle w:val="PreformattedText"/>
-        <w:bidi w:val="0"/>
-        <w:spacing w:before="0" w:after="0"/>
-        <w:jc w:val="start"/>
-        <w:rPr/>
-      </w:pPr>
-      <w:r>
-        <w:rPr/>
-      </w:r>
-    </w:p>
-    <w:p>
-      <w:pPr>
-        <w:pStyle w:val="PreformattedText"/>
-        <w:bidi w:val="0"/>
-        <w:spacing w:before="0" w:after="0"/>
-        <w:jc w:val="start"/>
-        <w:rPr/>
-      </w:pPr>
-      <w:r>
-        <w:rPr/>
-        <w:t>As for the hint feature, rather than having it as an option willy-nilly, I implemented it so that if your health is 25HP or lower on your turn you are presented with the option to buy a hint in exchange for 10 points. If you choose to accept the offer everything on the board is revealed for 10 seconds.</w:t>
-      </w:r>
-    </w:p>
-    <w:p>
-      <w:pPr>
-        <w:pStyle w:val="PreformattedText"/>
-        <w:bidi w:val="0"/>
-        <w:spacing w:before="0" w:after="0"/>
-        <w:jc w:val="start"/>
-        <w:rPr/>
-      </w:pPr>
-      <w:r>
-        <w:rPr/>
-      </w:r>
-    </w:p>
-    <w:p>
-      <w:pPr>
-        <w:pStyle w:val="PreformattedText"/>
-        <w:bidi w:val="0"/>
-        <w:spacing w:before="0" w:after="0"/>
-        <w:jc w:val="start"/>
-        <w:rPr/>
-      </w:pPr>
-      <w:r>
-        <w:rPr/>
-        <w:t>Around half way into developing the game I realised it would be super easy cheese points and win by guessing the same tile as many times as you wanted</w:t>
+        <w:t xml:space="preserve">The MegaGuess is implemented differently - I decided to make it reveal a whole row rather than a block of tiles as if you had guessed that row yourself meaning you receive points for creatures </w:t>
+      </w:r>
+      <w:r>
+        <w:rPr/>
+        <w:t>HOWEVER,</w:t>
+      </w:r>
+      <w:r>
+        <w:rPr/>
+        <w:t xml:space="preserve"> any negative tiles like the bomb will </w:t>
+      </w:r>
+      <w:r>
+        <w:rPr/>
+        <w:t xml:space="preserve">also be </w:t>
+      </w:r>
+      <w:r>
+        <w:rPr/>
+        <w:t>activated too.</w:t>
+      </w:r>
+    </w:p>
+    <w:p>
+      <w:pPr>
+        <w:pStyle w:val="PreformattedText"/>
+        <w:bidi w:val="0"/>
+        <w:spacing w:before="0" w:after="0"/>
+        <w:jc w:val="start"/>
+        <w:rPr/>
+      </w:pPr>
+      <w:r>
+        <w:rPr/>
+      </w:r>
+    </w:p>
+    <w:p>
+      <w:pPr>
+        <w:pStyle w:val="PreformattedText"/>
+        <w:bidi w:val="0"/>
+        <w:spacing w:before="0" w:after="0"/>
+        <w:jc w:val="start"/>
+        <w:rPr/>
+      </w:pPr>
+      <w:r>
+        <w:rPr/>
+        <w:t xml:space="preserve">As for the hint feature, rather than having it as an option </w:t>
+      </w:r>
+      <w:r>
+        <w:rPr/>
+        <w:t>all the time</w:t>
+      </w:r>
+      <w:r>
+        <w:rPr/>
+        <w:t>, I implemented it so that if your health is 25HP or lower on your turn you are presented with the option to buy a hint in exchange for 10 points. If you choose to accept the offer everything on the board is revealed for 10 seconds.</w:t>
+      </w:r>
+    </w:p>
+    <w:p>
+      <w:pPr>
+        <w:pStyle w:val="PreformattedText"/>
+        <w:bidi w:val="0"/>
+        <w:spacing w:before="0" w:after="0"/>
+        <w:jc w:val="start"/>
+        <w:rPr/>
+      </w:pPr>
+      <w:r>
+        <w:rPr/>
+      </w:r>
+    </w:p>
+    <w:p>
+      <w:pPr>
+        <w:pStyle w:val="PreformattedText"/>
+        <w:bidi w:val="0"/>
+        <w:spacing w:before="0" w:after="0"/>
+        <w:jc w:val="start"/>
+        <w:rPr/>
+      </w:pPr>
+      <w:r>
+        <w:rPr/>
+        <w:t xml:space="preserve">Around half way into developing the game I realised it would be super easy cheese points and win by guessing the same tile as many times as you wanted </w:t>
+      </w:r>
+      <w:r>
+        <w:rPr/>
+        <w:t>so I put a stop to that by checking if the player has already guessed that tile.</w:t>
+      </w:r>
+    </w:p>
+    <w:p>
+      <w:pPr>
+        <w:pStyle w:val="PreformattedText"/>
+        <w:bidi w:val="0"/>
+        <w:spacing w:before="0" w:after="0"/>
+        <w:jc w:val="start"/>
+        <w:rPr/>
+      </w:pPr>
+      <w:r>
+        <w:rPr/>
+      </w:r>
+    </w:p>
+    <w:p>
+      <w:pPr>
+        <w:pStyle w:val="PreformattedText"/>
+        <w:bidi w:val="0"/>
+        <w:spacing w:before="0" w:after="0"/>
+        <w:jc w:val="start"/>
+        <w:rPr/>
+      </w:pPr>
+      <w:r>
+        <w:rPr/>
+      </w:r>
+    </w:p>
+    <w:p>
+      <w:pPr>
+        <w:pStyle w:val="PreformattedText"/>
+        <w:bidi w:val="0"/>
+        <w:spacing w:before="0" w:after="0"/>
+        <w:jc w:val="start"/>
+        <w:rPr/>
+      </w:pPr>
+      <w:r>
+        <w:rPr/>
+      </w:r>
+    </w:p>
+    <w:p>
+      <w:pPr>
+        <w:pStyle w:val="PreformattedText"/>
+        <w:bidi w:val="0"/>
+        <w:spacing w:before="0" w:after="0"/>
+        <w:jc w:val="start"/>
+        <w:rPr/>
+      </w:pPr>
+      <w:r>
+        <w:rPr/>
+        <w:t>To criticise my program I know some of the code is very sloppy and inefficien</w:t>
+      </w:r>
+      <w:r>
+        <w:rPr/>
+        <w:t>t because</w:t>
+      </w:r>
+      <w:r>
+        <w:rPr/>
+        <w:t xml:space="preserve"> I’m not used to object oriented programming </w:t>
+      </w:r>
+      <w:r>
+        <w:rPr/>
+        <w:t>or Java</w:t>
+      </w:r>
+      <w:r>
+        <w:rPr/>
+        <w:t xml:space="preserve">. I particularly dislike the way I check if a whole creature has been found, its far to complicated and unreadable, </w:t>
+      </w:r>
+      <w:r>
+        <w:rPr/>
+        <w:t>if I had more time I would certainly sort that out.</w:t>
+      </w:r>
+      <w:r>
+        <w:rPr/>
+        <w:t xml:space="preserve"> </w:t>
+      </w:r>
+      <w:r>
+        <w:rPr/>
+        <w:t>I didn’t realise I could invert the 2D board array so its more intuitive to read until after I finished the rest of the game and I don’t have the willpower to reimplement it.</w:t>
+      </w:r>
+    </w:p>
+    <w:p>
+      <w:pPr>
+        <w:pStyle w:val="PreformattedText"/>
+        <w:bidi w:val="0"/>
+        <w:spacing w:before="0" w:after="0"/>
+        <w:jc w:val="start"/>
+        <w:rPr/>
+      </w:pPr>
+      <w:r>
+        <w:rPr/>
+      </w:r>
+    </w:p>
+    <w:p>
+      <w:pPr>
+        <w:pStyle w:val="PreformattedText"/>
+        <w:bidi w:val="0"/>
+        <w:spacing w:before="0" w:after="0"/>
+        <w:jc w:val="start"/>
+        <w:rPr/>
+      </w:pPr>
+      <w:r>
+        <w:rPr/>
+        <w:t xml:space="preserve">One of the things I’m proud of is the UI. I spent some time on it to make it look like an old DOS program with the colours and (which is why it works best in a terminal). </w:t>
+      </w:r>
+      <w:r>
+        <w:rPr/>
+        <w:t>I am pleased I how to clear lines from/the whole terminal, it makes the whole experience so much better</w:t>
       </w:r>
     </w:p>
     <w:sectPr>
@@ -1027,6 +1329,16 @@
       <w:sz w:val="20"/>
       <w:szCs w:val="20"/>
     </w:rPr>
+  </w:style>
+  <w:style w:type="paragraph" w:styleId="TableContents">
+    <w:name w:val="Table Contents"/>
+    <w:basedOn w:val="Normal"/>
+    <w:qFormat/>
+    <w:pPr>
+      <w:widowControl w:val="false"/>
+      <w:suppressLineNumbers/>
+    </w:pPr>
+    <w:rPr/>
   </w:style>
 </w:styles>
 </file>

</xml_diff>